<commit_message>
[docker] Join Zou to the Keycloak network and add .env.example
Add docker-compose.keycloak.yml, enabled through COMPOSE_FILE in a local
.env, so that Zou reaches Keycloak by name. Ignore Linux/.env, which may
hold a client secret. Update the Readme and doc/MLW_Integration.docx.

Co-Authored-By: Claude Sonnet 5.5 <noreply@anthropic.com>
</commit_message>
<xml_diff>
--- a/doc/MLW_Integration.docx
+++ b/doc/MLW_Integration.docx
@@ -584,7 +584,27 @@
     </w:p>
     <w:p>
       <w:r>
-        <w:t xml:space="preserve">With a </w:t>
+        <w:t xml:space="preserve">Copy </w:t>
+      </w:r>
+      <w:r>
+        <w:rPr>
+          <w:rFonts w:ascii="Consolas" w:hAnsi="Consolas"/>
+          <w:sz w:val="20"/>
+        </w:rPr>
+        <w:t>Linux/.env.example</w:t>
+      </w:r>
+      <w:r>
+        <w:t xml:space="preserve"> to </w:t>
+      </w:r>
+      <w:r>
+        <w:rPr>
+          <w:rFonts w:ascii="Consolas" w:hAnsi="Consolas"/>
+          <w:sz w:val="20"/>
+        </w:rPr>
+        <w:t>Linux/.env</w:t>
+      </w:r>
+      <w:r>
+        <w:t xml:space="preserve"> and adjust it. </w:t>
       </w:r>
       <w:r>
         <w:rPr>
@@ -594,17 +614,7 @@
         <w:t>.env</w:t>
       </w:r>
       <w:r>
-        <w:t xml:space="preserve"> file next to </w:t>
-      </w:r>
-      <w:r>
-        <w:rPr>
-          <w:rFonts w:ascii="Consolas" w:hAnsi="Consolas"/>
-          <w:sz w:val="20"/>
-        </w:rPr>
-        <w:t>Linux/docker-compose.yml</w:t>
-      </w:r>
-      <w:r>
-        <w:t xml:space="preserve"> (do not commit it if it holds a secret):</w:t>
+        <w:t xml:space="preserve"> is ignored by git because it may hold a client secret. The example holds:</w:t>
       </w:r>
     </w:p>
     <w:tbl>
@@ -626,6 +636,18 @@
               <w:spacing w:after="0"/>
             </w:pPr>
             <w:r/>
+            <w:r>
+              <w:rPr>
+                <w:rFonts w:ascii="Consolas" w:hAnsi="Consolas"/>
+                <w:sz w:val="18"/>
+              </w:rPr>
+              <w:t>COMPOSE_FILE=docker-compose.yml:docker-compose.keycloak.yml</w:t>
+            </w:r>
+          </w:p>
+          <w:p>
+            <w:pPr>
+              <w:spacing w:after="0"/>
+            </w:pPr>
             <w:r>
               <w:rPr>
                 <w:rFonts w:ascii="Consolas" w:hAnsi="Consolas"/>
@@ -679,7 +701,31 @@
                 <w:rFonts w:ascii="Consolas" w:hAnsi="Consolas"/>
                 <w:sz w:val="18"/>
               </w:rPr>
+              <w:t>KEYCLOAK_CLIENT_SECRET=</w:t>
+            </w:r>
+          </w:p>
+          <w:p>
+            <w:pPr>
+              <w:spacing w:after="0"/>
+            </w:pPr>
+            <w:r>
+              <w:rPr>
+                <w:rFonts w:ascii="Consolas" w:hAnsi="Consolas"/>
+                <w:sz w:val="18"/>
+              </w:rPr>
               <w:t>KEYCLOAK_ROLE_MAP=mlw-kitsu-user:user</w:t>
+            </w:r>
+          </w:p>
+          <w:p>
+            <w:pPr>
+              <w:spacing w:after="0"/>
+            </w:pPr>
+            <w:r>
+              <w:rPr>
+                <w:rFonts w:ascii="Consolas" w:hAnsi="Consolas"/>
+                <w:sz w:val="18"/>
+              </w:rPr>
+              <w:t>KEYCLOAK_DEFAULT_ROLE=user</w:t>
             </w:r>
           </w:p>
         </w:tc>
@@ -796,6 +842,41 @@
     </w:tbl>
     <w:p/>
     <w:p>
+      <w:r>
+        <w:t xml:space="preserve">To go back to local accounts, remove </w:t>
+      </w:r>
+      <w:r>
+        <w:rPr>
+          <w:rFonts w:ascii="Consolas" w:hAnsi="Consolas"/>
+          <w:sz w:val="20"/>
+        </w:rPr>
+        <w:t>.env</w:t>
+      </w:r>
+      <w:r>
+        <w:t xml:space="preserve"> (or set </w:t>
+      </w:r>
+      <w:r>
+        <w:rPr>
+          <w:rFonts w:ascii="Consolas" w:hAnsi="Consolas"/>
+          <w:sz w:val="20"/>
+        </w:rPr>
+        <w:t>AUTH_STRATEGY=auth_local_classic</w:t>
+      </w:r>
+      <w:r>
+        <w:t xml:space="preserve">) and run </w:t>
+      </w:r>
+      <w:r>
+        <w:rPr>
+          <w:rFonts w:ascii="Consolas" w:hAnsi="Consolas"/>
+          <w:sz w:val="20"/>
+        </w:rPr>
+        <w:t>docker compose up -d</w:t>
+      </w:r>
+      <w:r>
+        <w:t xml:space="preserve"> again.</w:t>
+      </w:r>
+    </w:p>
+    <w:p>
       <w:pPr>
         <w:pStyle w:val="Heading1"/>
       </w:pPr>
@@ -815,7 +896,7 @@
         <w:t>localhost</w:t>
       </w:r>
       <w:r>
-        <w:t xml:space="preserve"> is the container itself, not the host. In the current development setup Keycloak (container </w:t>
+        <w:t xml:space="preserve"> is the container itself, not the host. Keycloak (container </w:t>
       </w:r>
       <w:r>
         <w:rPr>
@@ -825,7 +906,7 @@
         <w:t>mlw-keycloak</w:t>
       </w:r>
       <w:r>
-        <w:t xml:space="preserve">) is published on </w:t>
+        <w:t xml:space="preserve">) is also published on </w:t>
       </w:r>
       <w:r>
         <w:rPr>
@@ -835,7 +916,7 @@
         <w:t>127.0.0.1:8180</w:t>
       </w:r>
       <w:r>
-        <w:t xml:space="preserve"> only, so the host address does not work from a container either. Use one of:</w:t>
+        <w:t xml:space="preserve"> only, so the host address does not work from a container either. The setup therefore uses a shared Docker network:</w:t>
       </w:r>
     </w:p>
     <w:p>
@@ -845,12 +926,13 @@
       <w:r/>
       <w:r>
         <w:rPr>
-          <w:b/>
+          <w:rFonts w:ascii="Consolas" w:hAnsi="Consolas"/>
+          <w:sz w:val="20"/>
         </w:rPr>
-        <w:t>Shared Docker network (recommended).</w:t>
+        <w:t>Linux/docker-compose.keycloak.yml</w:t>
       </w:r>
       <w:r>
-        <w:t xml:space="preserve"> Attach both the </w:t>
+        <w:t xml:space="preserve"> is a compose override. It adds the </w:t>
       </w:r>
       <w:r>
         <w:rPr>
@@ -860,7 +942,81 @@
         <w:t>zou</w:t>
       </w:r>
       <w:r>
-        <w:t xml:space="preserve"> service and the Keycloak container to the same network and use the container name and its internal port, for example </w:t>
+        <w:t xml:space="preserve"> service to an external network, named by </w:t>
+      </w:r>
+      <w:r>
+        <w:rPr>
+          <w:rFonts w:ascii="Consolas" w:hAnsi="Consolas"/>
+          <w:sz w:val="20"/>
+        </w:rPr>
+        <w:t>KEYCLOAK_NETWORK</w:t>
+      </w:r>
+      <w:r>
+        <w:t xml:space="preserve"> (default </w:t>
+      </w:r>
+      <w:r>
+        <w:rPr>
+          <w:rFonts w:ascii="Consolas" w:hAnsi="Consolas"/>
+          <w:sz w:val="20"/>
+        </w:rPr>
+        <w:t>mlw-platform_default</w:t>
+      </w:r>
+      <w:r>
+        <w:t>, the network of the Keycloak container).</w:t>
+      </w:r>
+    </w:p>
+    <w:p>
+      <w:pPr>
+        <w:pStyle w:val="ListBullet"/>
+      </w:pPr>
+      <w:r/>
+      <w:r>
+        <w:rPr>
+          <w:rFonts w:ascii="Consolas" w:hAnsi="Consolas"/>
+          <w:sz w:val="20"/>
+        </w:rPr>
+        <w:t>COMPOSE_FILE</w:t>
+      </w:r>
+      <w:r>
+        <w:t xml:space="preserve"> in </w:t>
+      </w:r>
+      <w:r>
+        <w:rPr>
+          <w:rFonts w:ascii="Consolas" w:hAnsi="Consolas"/>
+          <w:sz w:val="20"/>
+        </w:rPr>
+        <w:t>.env</w:t>
+      </w:r>
+      <w:r>
+        <w:t xml:space="preserve"> tells compose to read the override. It is not in the base file, so a setup without Keycloak still starts when that network does not exist.</w:t>
+      </w:r>
+    </w:p>
+    <w:p>
+      <w:pPr>
+        <w:pStyle w:val="ListBullet"/>
+      </w:pPr>
+      <w:r>
+        <w:t xml:space="preserve">On that network the container answers to </w:t>
+      </w:r>
+      <w:r>
+        <w:rPr>
+          <w:rFonts w:ascii="Consolas" w:hAnsi="Consolas"/>
+          <w:sz w:val="20"/>
+        </w:rPr>
+        <w:t>mlw-keycloak</w:t>
+      </w:r>
+      <w:r>
+        <w:t xml:space="preserve"> on its internal port, so </w:t>
+      </w:r>
+      <w:r>
+        <w:rPr>
+          <w:rFonts w:ascii="Consolas" w:hAnsi="Consolas"/>
+          <w:sz w:val="20"/>
+        </w:rPr>
+        <w:t>KEYCLOAK_SERVER_URL</w:t>
+      </w:r>
+      <w:r>
+        <w:t xml:space="preserve"> is </w:t>
       </w:r>
       <w:r>
         <w:rPr>
@@ -874,28 +1030,28 @@
       </w:r>
     </w:p>
     <w:p>
-      <w:pPr>
-        <w:pStyle w:val="ListBullet"/>
-      </w:pPr>
-      <w:r/>
       <w:r>
-        <w:rPr>
-          <w:b/>
-        </w:rPr>
-        <w:t>Published on all interfaces.</w:t>
-      </w:r>
-      <w:r>
-        <w:t xml:space="preserve"> Publish Keycloak on </w:t>
+        <w:t>Zou does not check the issuer of the token, so the host name used to reach Keycloak does not have to match the public one (</w:t>
       </w:r>
       <w:r>
         <w:rPr>
           <w:rFonts w:ascii="Consolas" w:hAnsi="Consolas"/>
           <w:sz w:val="20"/>
         </w:rPr>
-        <w:t>0.0.0.0:8180</w:t>
+        <w:t>KC_HOSTNAME</w:t>
       </w:r>
       <w:r>
-        <w:t xml:space="preserve">, add </w:t>
+        <w:t xml:space="preserve"> is </w:t>
+      </w:r>
+      <w:r>
+        <w:rPr>
+          <w:rFonts w:ascii="Consolas" w:hAnsi="Consolas"/>
+          <w:sz w:val="20"/>
+        </w:rPr>
+        <w:t>http://localhost:8180</w:t>
+      </w:r>
+      <w:r>
+        <w:t xml:space="preserve"> on this Keycloak). Another way, if a shared network is not wanted: publish Keycloak on all interfaces, add </w:t>
       </w:r>
       <w:r>
         <w:rPr>
@@ -915,7 +1071,7 @@
         <w:t>zou</w:t>
       </w:r>
       <w:r>
-        <w:t xml:space="preserve"> service, and use </w:t>
+        <w:t xml:space="preserve"> service and use </w:t>
       </w:r>
       <w:r>
         <w:rPr>
@@ -926,23 +1082,6 @@
       </w:r>
       <w:r>
         <w:t>.</w:t>
-      </w:r>
-    </w:p>
-    <w:p>
-      <w:r>
-        <w:t>Zou does not check the issuer of the token, so the host name used to reach Keycloak does not have to match the public one.</w:t>
-      </w:r>
-    </w:p>
-    <w:p>
-      <w:r/>
-      <w:r>
-        <w:rPr>
-          <w:b/>
-        </w:rPr>
-        <w:t>Status:</w:t>
-      </w:r>
-      <w:r>
-        <w:t xml:space="preserve"> the compose file does not yet join a shared network. This still has to be added and tried (see section 8).</w:t>
       </w:r>
     </w:p>
     <w:p>
@@ -1438,27 +1577,17 @@
         <w:pStyle w:val="ListBullet"/>
       </w:pPr>
       <w:r>
-        <w:t xml:space="preserve">The settings and their defaults are in </w:t>
+        <w:t xml:space="preserve">Checked against the real </w:t>
       </w:r>
       <w:r>
         <w:rPr>
           <w:rFonts w:ascii="Consolas" w:hAnsi="Consolas"/>
           <w:sz w:val="20"/>
         </w:rPr>
-        <w:t>Linux/docker-compose.yml</w:t>
+        <w:t>mlw</w:t>
       </w:r>
       <w:r>
-        <w:t xml:space="preserve">, and </w:t>
-      </w:r>
-      <w:r>
-        <w:rPr>
-          <w:rFonts w:ascii="Consolas" w:hAnsi="Consolas"/>
-          <w:sz w:val="20"/>
-        </w:rPr>
-        <w:t>docker compose config</w:t>
-      </w:r>
-      <w:r>
-        <w:t xml:space="preserve"> accepts the file.</w:t>
+        <w:t xml:space="preserve"> realm with Zou running in the container built here: login by email 200, login by username 200, wrong password 400, person created as Mark Millard with role user.</w:t>
       </w:r>
     </w:p>
     <w:p>
@@ -1466,7 +1595,17 @@
         <w:pStyle w:val="ListBullet"/>
       </w:pPr>
       <w:r>
-        <w:t>The Keycloak login itself was checked with Zou run from a Python environment on the host, not yet from the container built here.</w:t>
+        <w:t xml:space="preserve">Zou reaches Keycloak at </w:t>
+      </w:r>
+      <w:r>
+        <w:rPr>
+          <w:rFonts w:ascii="Consolas" w:hAnsi="Consolas"/>
+          <w:sz w:val="20"/>
+        </w:rPr>
+        <w:t>http://mlw-keycloak:8080</w:t>
+      </w:r>
+      <w:r>
+        <w:t xml:space="preserve"> over the shared network.</w:t>
       </w:r>
     </w:p>
     <w:p>
@@ -1474,7 +1613,7 @@
         <w:pStyle w:val="ListBullet"/>
       </w:pPr>
       <w:r>
-        <w:t>To do: join the Zou and Keycloak containers to a shared network, then run the checks of section 7 against the container.</w:t>
+        <w:t>Not yet checked: a login from the Kitsu page in a browser.</w:t>
       </w:r>
     </w:p>
     <w:sectPr>

</xml_diff>

<commit_message>
[docker] Pass KEYCLOAK_SYNC_ROLE and map an admin role in .env.example
Co-Authored-By: Claude Sonnet 5.5 <noreply@anthropic.com>
</commit_message>
<xml_diff>
--- a/doc/MLW_Integration.docx
+++ b/doc/MLW_Integration.docx
@@ -572,6 +572,71 @@
           </w:p>
         </w:tc>
       </w:tr>
+      <w:tr>
+        <w:tc>
+          <w:tcPr>
+            <w:tcW w:type="dxa" w:w="2736"/>
+          </w:tcPr>
+          <w:p>
+            <w:r/>
+            <w:r/>
+            <w:r>
+              <w:rPr>
+                <w:rFonts w:ascii="Consolas" w:hAnsi="Consolas"/>
+                <w:sz w:val="20"/>
+              </w:rPr>
+              <w:t>KEYCLOAK_SYNC_ROLE</w:t>
+            </w:r>
+            <w:r/>
+          </w:p>
+        </w:tc>
+        <w:tc>
+          <w:tcPr>
+            <w:tcW w:type="dxa" w:w="2736"/>
+          </w:tcPr>
+          <w:p>
+            <w:r/>
+            <w:r/>
+            <w:r>
+              <w:rPr>
+                <w:rFonts w:ascii="Consolas" w:hAnsi="Consolas"/>
+                <w:sz w:val="20"/>
+              </w:rPr>
+              <w:t>always</w:t>
+            </w:r>
+            <w:r/>
+          </w:p>
+        </w:tc>
+        <w:tc>
+          <w:tcPr>
+            <w:tcW w:type="dxa" w:w="3888"/>
+          </w:tcPr>
+          <w:p>
+            <w:r/>
+            <w:r/>
+            <w:r>
+              <w:rPr>
+                <w:rFonts w:ascii="Consolas" w:hAnsi="Consolas"/>
+                <w:sz w:val="20"/>
+              </w:rPr>
+              <w:t>always</w:t>
+            </w:r>
+            <w:r>
+              <w:t xml:space="preserve">: the role follows Keycloak at every login. </w:t>
+            </w:r>
+            <w:r>
+              <w:rPr>
+                <w:rFonts w:ascii="Consolas" w:hAnsi="Consolas"/>
+                <w:sz w:val="20"/>
+              </w:rPr>
+              <w:t>first-login</w:t>
+            </w:r>
+            <w:r>
+              <w:t>: set only when the person is created, later changes made in Kitsu are kept.</w:t>
+            </w:r>
+          </w:p>
+        </w:tc>
+      </w:tr>
     </w:tbl>
     <w:p/>
     <w:p>
@@ -713,7 +778,7 @@
                 <w:rFonts w:ascii="Consolas" w:hAnsi="Consolas"/>
                 <w:sz w:val="18"/>
               </w:rPr>
-              <w:t>KEYCLOAK_ROLE_MAP=mlw-kitsu-user:user</w:t>
+              <w:t>KEYCLOAK_ROLE_MAP=mlw-kitsu-user:user;mlw-kitsu-admin:admin</w:t>
             </w:r>
           </w:p>
           <w:p>
@@ -728,10 +793,47 @@
               <w:t>KEYCLOAK_DEFAULT_ROLE=user</w:t>
             </w:r>
           </w:p>
+          <w:p>
+            <w:pPr>
+              <w:spacing w:after="0"/>
+            </w:pPr>
+            <w:r>
+              <w:rPr>
+                <w:rFonts w:ascii="Consolas" w:hAnsi="Consolas"/>
+                <w:sz w:val="18"/>
+              </w:rPr>
+              <w:t>KEYCLOAK_SYNC_ROLE=always</w:t>
+            </w:r>
+          </w:p>
         </w:tc>
       </w:tr>
     </w:tbl>
     <w:p/>
+    <w:p>
+      <w:r>
+        <w:t xml:space="preserve">Map an admin role as well: with </w:t>
+      </w:r>
+      <w:r>
+        <w:rPr>
+          <w:rFonts w:ascii="Consolas" w:hAnsi="Consolas"/>
+          <w:sz w:val="20"/>
+        </w:rPr>
+        <w:t>KEYCLOAK_SYNC_ROLE=always</w:t>
+      </w:r>
+      <w:r>
+        <w:t xml:space="preserve"> an existing administrator is set back to the mapped role at the next login, so an account without a Keycloak admin role loses its rights. </w:t>
+      </w:r>
+      <w:r>
+        <w:rPr>
+          <w:rFonts w:ascii="Consolas" w:hAnsi="Consolas"/>
+          <w:sz w:val="20"/>
+        </w:rPr>
+        <w:t>first-login</w:t>
+      </w:r>
+      <w:r>
+        <w:t xml:space="preserve"> avoids that.</w:t>
+      </w:r>
+    </w:p>
     <w:p>
       <w:r>
         <w:t>Then rebuild and start:</w:t>
@@ -1170,7 +1272,7 @@
         <w:t>mlw-kitsu-user</w:t>
       </w:r>
       <w:r>
-        <w:t xml:space="preserve">; it is mapped to the Kitsu role </w:t>
+        <w:t xml:space="preserve">, mapped to the Kitsu role </w:t>
       </w:r>
       <w:r>
         <w:rPr>
@@ -1178,6 +1280,26 @@
           <w:sz w:val="20"/>
         </w:rPr>
         <w:t>user</w:t>
+      </w:r>
+      <w:r>
+        <w:t xml:space="preserve">; </w:t>
+      </w:r>
+      <w:r>
+        <w:rPr>
+          <w:rFonts w:ascii="Consolas" w:hAnsi="Consolas"/>
+          <w:sz w:val="20"/>
+        </w:rPr>
+        <w:t>mlw-kitsu-admin</w:t>
+      </w:r>
+      <w:r>
+        <w:t xml:space="preserve"> is mapped to </w:t>
+      </w:r>
+      <w:r>
+        <w:rPr>
+          <w:rFonts w:ascii="Consolas" w:hAnsi="Consolas"/>
+          <w:sz w:val="20"/>
+        </w:rPr>
+        <w:t>admin</w:t>
       </w:r>
       <w:r>
         <w:t>.</w:t>
@@ -1536,6 +1658,40 @@
           <w:p>
             <w:r/>
             <w:r>
+              <w:t>An administrator became a plain user</w:t>
+            </w:r>
+          </w:p>
+        </w:tc>
+        <w:tc>
+          <w:tcPr>
+            <w:tcW w:type="dxa" w:w="5040"/>
+          </w:tcPr>
+          <w:p>
+            <w:r/>
+            <w:r>
+              <w:t xml:space="preserve">The role follows Keycloak at every login. Map a Keycloak admin role, or use </w:t>
+            </w:r>
+            <w:r>
+              <w:rPr>
+                <w:rFonts w:ascii="Consolas" w:hAnsi="Consolas"/>
+                <w:sz w:val="20"/>
+              </w:rPr>
+              <w:t>KEYCLOAK_SYNC_ROLE=first-login</w:t>
+            </w:r>
+            <w:r>
+              <w:t>.</w:t>
+            </w:r>
+          </w:p>
+        </w:tc>
+      </w:tr>
+      <w:tr>
+        <w:tc>
+          <w:tcPr>
+            <w:tcW w:type="dxa" w:w="4320"/>
+          </w:tcPr>
+          <w:p>
+            <w:r/>
+            <w:r>
               <w:t>No Keycloak lines at all</w:t>
             </w:r>
           </w:p>

</xml_diff>